<commit_message>
feat(forms): name split, work-auth dropdown, US billing address, MM-DD-YYYY dates, alphanumeric SSN, Appendix1 work-auth upload, cheque-date removal, ERM signature date on ERM sign
Co-Authored-By: Claude Opus 4.8 <noreply@anthropic.com>
</commit_message>
<xml_diff>
--- a/backend/src/main/resources/templates/SageITCO_Master_Agreement_TEMPLATE.docx
+++ b/backend/src/main/resources/templates/SageITCO_Master_Agreement_TEMPLATE.docx
@@ -2833,7 +2833,7 @@
               <w:rPr>
                 <w:sz w:val="20"/>
               </w:rPr>
-              <w:t>Date: ${signatureDate}</w:t>
+              <w:t>Date: ${ermSignatureDate}</w:t>
             </w:r>
           </w:p>
         </w:tc>
@@ -3577,7 +3577,7 @@
               <w:rPr>
                 <w:sz w:val="20"/>
               </w:rPr>
-              <w:t>Date: ${signatureDate}</w:t>
+              <w:t>Date: ${ermSignatureDate}</w:t>
             </w:r>
           </w:p>
         </w:tc>
@@ -4249,21 +4249,7 @@
               <w:rPr>
                 <w:sz w:val="20"/>
               </w:rPr>
-              <w:t>Date: ${</w:t>
-            </w:r>
-            <w:proofErr w:type="spellStart"/>
-            <w:r>
-              <w:rPr>
-                <w:sz w:val="20"/>
-              </w:rPr>
-              <w:t>signatureDate</w:t>
-            </w:r>
-            <w:proofErr w:type="spellEnd"/>
-            <w:r>
-              <w:rPr>
-                <w:sz w:val="20"/>
-              </w:rPr>
-              <w:t>}</w:t>
+              <w:t>Date: ${ermSignatureDate}</w:t>
             </w:r>
           </w:p>
         </w:tc>
@@ -5262,7 +5248,7 @@
               <w:rPr>
                 <w:sz w:val="20"/>
               </w:rPr>
-              <w:t>Date: ${signatureDate}</w:t>
+              <w:t>Date: ${ermSignatureDate}</w:t>
             </w:r>
           </w:p>
         </w:tc>
@@ -6100,7 +6086,7 @@
               <w:rPr>
                 <w:sz w:val="20"/>
               </w:rPr>
-              <w:t>Date: ${signatureDate}</w:t>
+              <w:t>Date: ${ermSignatureDate}</w:t>
             </w:r>
           </w:p>
         </w:tc>
@@ -6650,7 +6636,7 @@
               <w:rPr>
                 <w:sz w:val="20"/>
               </w:rPr>
-              <w:t>Date: ${signatureDate}</w:t>
+              <w:t>Date: ${ermSignatureDate}</w:t>
             </w:r>
           </w:p>
         </w:tc>
@@ -7224,7 +7210,7 @@
               <w:rPr>
                 <w:sz w:val="20"/>
               </w:rPr>
-              <w:t>Date: ${signatureDate}</w:t>
+              <w:t>Date: ${ermSignatureDate}</w:t>
             </w:r>
           </w:p>
         </w:tc>
@@ -8188,7 +8174,7 @@
               <w:rPr>
                 <w:sz w:val="20"/>
               </w:rPr>
-              <w:t>Date: ${signatureDate}</w:t>
+              <w:t>Date: ${ermSignatureDate}</w:t>
             </w:r>
           </w:p>
         </w:tc>

</xml_diff>

<commit_message>
feat(agreements): Appendix 1 Schedule 1 Month/Period is one ERM-set merged cell (prefilled at create; revisable like the rate schedule)
- DOCX template: vertically merge the Month/Period column of the Phase 2
  Monthly Deliverables table into a single cell driven by ${phase2DeliverablePeriod}
  (4 hardcoded period rows -> one merged cell; deliverable summaries unchanged)
- new entity field phase2_deliverable_period (additive) + buildContext mapping
- ERM prefills it at create; shown read-only in the ERM detail view
- ermRequestRevision can correct it -> auto-scopes Appendix 1 for consultant
  re-review/re-sign (FIELD_SECTION + RequestRevisionModal input)
- test proves the merged cell + placeholder survive applyTemplateSurgery

Co-Authored-By: Claude Opus 4.8 <noreply@anthropic.com>
</commit_message>
<xml_diff>
--- a/backend/src/main/resources/templates/SageITCO_Master_Agreement_TEMPLATE.docx
+++ b/backend/src/main/resources/templates/SageITCO_Master_Agreement_TEMPLATE.docx
@@ -5385,6 +5385,7 @@
         <w:tc>
           <w:tcPr>
             <w:tcW w:w="2304" w:type="dxa"/>
+            <w:vMerge w:val="restart"/>
             <w:vAlign w:val="center"/>
           </w:tcPr>
           <w:p>
@@ -5395,7 +5396,7 @@
               <w:rPr>
                 <w:sz w:val="19"/>
               </w:rPr>
-              <w:t>Month 1</w:t>
+              <w:t>${phase2DeliverablePeriod}</w:t>
             </w:r>
           </w:p>
         </w:tc>
@@ -5434,18 +5435,13 @@
         <w:tc>
           <w:tcPr>
             <w:tcW w:w="2304" w:type="dxa"/>
+            <w:vMerge/>
             <w:vAlign w:val="center"/>
           </w:tcPr>
           <w:p>
             <w:pPr>
               <w:jc w:val="both"/>
             </w:pPr>
-            <w:r>
-              <w:rPr>
-                <w:sz w:val="19"/>
-              </w:rPr>
-              <w:t>Months 2–6</w:t>
-            </w:r>
           </w:p>
         </w:tc>
         <w:tc>
@@ -5474,18 +5470,13 @@
         <w:tc>
           <w:tcPr>
             <w:tcW w:w="2304" w:type="dxa"/>
+            <w:vMerge/>
             <w:vAlign w:val="center"/>
           </w:tcPr>
           <w:p>
             <w:pPr>
               <w:jc w:val="both"/>
             </w:pPr>
-            <w:r>
-              <w:rPr>
-                <w:sz w:val="19"/>
-              </w:rPr>
-              <w:t>Months 7–12</w:t>
-            </w:r>
           </w:p>
         </w:tc>
         <w:tc>
@@ -5514,18 +5505,13 @@
         <w:tc>
           <w:tcPr>
             <w:tcW w:w="2304" w:type="dxa"/>
+            <w:vMerge/>
             <w:vAlign w:val="center"/>
           </w:tcPr>
           <w:p>
             <w:pPr>
               <w:jc w:val="both"/>
             </w:pPr>
-            <w:r>
-              <w:rPr>
-                <w:sz w:val="19"/>
-              </w:rPr>
-              <w:t>Months 13–18</w:t>
-            </w:r>
           </w:p>
         </w:tc>
         <w:tc>

</xml_diff>